<commit_message>
add move images to own folder, add view sketch
</commit_message>
<xml_diff>
--- a/Info/Oetter_Tivoli_Fan_Moments_Skizze.docx
+++ b/Info/Oetter_Tivoli_Fan_Moments_Skizze.docx
@@ -427,10 +427,7 @@
         </w:numPr>
       </w:pPr>
       <w:r>
-        <w:t>Die App muss eine Möglichkeit zur Erstellung eines Benutzerkontos bieten</w:t>
-      </w:r>
-      <w:r>
-        <w:t>.</w:t>
+        <w:t>Die App muss eine Möglichkeit zur Erstellung eines Benutzerkontos bieten.</w:t>
       </w:r>
     </w:p>
     <w:p>
@@ -493,10 +490,7 @@
         </w:numPr>
       </w:pPr>
       <w:r>
-        <w:t>Die App soll eine Historie des Besuchers über alle besuchten Spiele darstellen könne</w:t>
-      </w:r>
-      <w:r>
-        <w:t>n.</w:t>
+        <w:t>Die App soll eine Historie des Besuchers über alle besuchten Spiele darstellen können.</w:t>
       </w:r>
     </w:p>
     <w:p>
@@ -588,7 +582,10 @@
       </w:pPr>
       <w:r>
         <w:lastRenderedPageBreak/>
-        <w:t>Konzept und geplanter Aufbau</w:t>
+        <w:t xml:space="preserve">Geplanter </w:t>
+      </w:r>
+      <w:r>
+        <w:t>Aufbau</w:t>
       </w:r>
     </w:p>
     <w:p>
@@ -631,641 +628,22 @@
     </w:p>
     <w:p>
       <w:r>
-        <w:t xml:space="preserve">- </w:t>
-      </w:r>
-      <w:proofErr w:type="spellStart"/>
-      <w:r>
-        <w:rPr>
-          <w:b/>
-          <w:bCs/>
-        </w:rPr>
-        <w:t>SwiftUI</w:t>
-      </w:r>
-      <w:proofErr w:type="spellEnd"/>
-      <w:r>
-        <w:t xml:space="preserve">: </w:t>
-      </w:r>
-      <w:proofErr w:type="spellStart"/>
-      <w:r>
-        <w:t>SwiftUI</w:t>
-      </w:r>
-      <w:proofErr w:type="spellEnd"/>
-      <w:r>
-        <w:t xml:space="preserve"> basiert auf dem MVVM-Prinzip und enthält alle von uns benötigten Komponenten aus einer Hand.</w:t>
-      </w:r>
-    </w:p>
-    <w:p>
-      <w:r>
-        <w:t xml:space="preserve">-  </w:t>
-      </w:r>
-      <w:r>
-        <w:rPr>
-          <w:b/>
-          <w:bCs/>
-        </w:rPr>
-        <w:t>Client-Server-Modell</w:t>
-      </w:r>
-      <w:r>
-        <w:t>: Durch das Nutzen des Client-Server-Modells können wir die generierten Faninhalte an alle interessierten Personen über das Internet ausspielen.</w:t>
-      </w:r>
-    </w:p>
-    <w:p>
-      <w:pPr>
-        <w:rPr>
-          <w:b/>
-          <w:bCs/>
-        </w:rPr>
-      </w:pPr>
-      <w:r>
-        <w:rPr>
-          <w:b/>
-          <w:bCs/>
-        </w:rPr>
-        <w:t>Vorgehensweise</w:t>
-      </w:r>
-    </w:p>
-    <w:p>
-      <w:pPr>
-        <w:pStyle w:val="Listenabsatz"/>
-        <w:numPr>
-          <w:ilvl w:val="0"/>
-          <w:numId w:val="23"/>
-        </w:numPr>
-        <w:rPr>
-          <w:b/>
-          <w:bCs/>
-        </w:rPr>
-      </w:pPr>
-      <w:r>
-        <w:rPr>
-          <w:b/>
-          <w:bCs/>
-        </w:rPr>
-        <w:t>Entwurf einer Datenbankstruktur</w:t>
-      </w:r>
-    </w:p>
-    <w:p>
-      <w:pPr>
-        <w:pStyle w:val="Listenabsatz"/>
-        <w:numPr>
-          <w:ilvl w:val="0"/>
-          <w:numId w:val="23"/>
-        </w:numPr>
-        <w:rPr>
-          <w:b/>
-          <w:bCs/>
-        </w:rPr>
-      </w:pPr>
-      <w:r>
-        <w:rPr>
-          <w:b/>
-          <w:bCs/>
-        </w:rPr>
-        <w:t xml:space="preserve">Erstellen und Einpflegen von </w:t>
-      </w:r>
-      <w:proofErr w:type="spellStart"/>
-      <w:r>
-        <w:rPr>
-          <w:b/>
-          <w:bCs/>
-        </w:rPr>
-        <w:t>Mockdaten</w:t>
-      </w:r>
-      <w:proofErr w:type="spellEnd"/>
-      <w:r>
-        <w:rPr>
-          <w:b/>
-          <w:bCs/>
-        </w:rPr>
-        <w:t xml:space="preserve"> </w:t>
-      </w:r>
-    </w:p>
-    <w:p>
-      <w:pPr>
-        <w:pStyle w:val="Listenabsatz"/>
-        <w:numPr>
-          <w:ilvl w:val="0"/>
-          <w:numId w:val="23"/>
-        </w:numPr>
-        <w:rPr>
-          <w:b/>
-          <w:bCs/>
-        </w:rPr>
-      </w:pPr>
-      <w:r>
-        <w:rPr>
-          <w:b/>
-          <w:bCs/>
-        </w:rPr>
-        <w:t>Erstellung der Benutzeroberfläche</w:t>
-      </w:r>
-    </w:p>
-    <w:p>
-      <w:pPr>
-        <w:pStyle w:val="Listenabsatz"/>
-        <w:numPr>
-          <w:ilvl w:val="1"/>
-          <w:numId w:val="23"/>
-        </w:numPr>
-        <w:rPr>
-          <w:b/>
-          <w:bCs/>
-        </w:rPr>
-      </w:pPr>
-      <w:r>
-        <w:rPr>
-          <w:b/>
-          <w:bCs/>
-        </w:rPr>
-        <w:t>Anmeldesicht</w:t>
-      </w:r>
-    </w:p>
-    <w:p>
-      <w:pPr>
-        <w:pStyle w:val="Listenabsatz"/>
-        <w:numPr>
-          <w:ilvl w:val="1"/>
-          <w:numId w:val="23"/>
-        </w:numPr>
-        <w:rPr>
-          <w:b/>
-          <w:bCs/>
-        </w:rPr>
-      </w:pPr>
-      <w:proofErr w:type="spellStart"/>
-      <w:r>
-        <w:rPr>
-          <w:b/>
-          <w:bCs/>
-        </w:rPr>
-        <w:t>Uploadansicht</w:t>
-      </w:r>
-      <w:proofErr w:type="spellEnd"/>
-    </w:p>
-    <w:p>
-      <w:pPr>
-        <w:pStyle w:val="Listenabsatz"/>
-        <w:numPr>
-          <w:ilvl w:val="1"/>
-          <w:numId w:val="23"/>
-        </w:numPr>
-        <w:rPr>
-          <w:b/>
-          <w:bCs/>
-        </w:rPr>
-      </w:pPr>
-      <w:r>
-        <w:rPr>
-          <w:b/>
-          <w:bCs/>
-        </w:rPr>
-        <w:t>Spielansicht</w:t>
-      </w:r>
-    </w:p>
-    <w:p>
-      <w:pPr>
-        <w:pStyle w:val="Listenabsatz"/>
-        <w:numPr>
-          <w:ilvl w:val="1"/>
-          <w:numId w:val="23"/>
-        </w:numPr>
-        <w:rPr>
-          <w:b/>
-          <w:bCs/>
-        </w:rPr>
-      </w:pPr>
-      <w:r>
-        <w:rPr>
-          <w:b/>
-          <w:bCs/>
-        </w:rPr>
-        <w:t>Zeitleiste</w:t>
-      </w:r>
-    </w:p>
-    <w:p>
-      <w:pPr>
-        <w:pStyle w:val="Listenabsatz"/>
-        <w:numPr>
-          <w:ilvl w:val="1"/>
-          <w:numId w:val="23"/>
-        </w:numPr>
-        <w:rPr>
-          <w:b/>
-          <w:bCs/>
-        </w:rPr>
-      </w:pPr>
-      <w:r>
-        <w:rPr>
-          <w:b/>
-          <w:bCs/>
-        </w:rPr>
-        <w:t>(Optional) Spielhistorie</w:t>
-      </w:r>
-    </w:p>
-    <w:p>
-      <w:pPr>
-        <w:pStyle w:val="Listenabsatz"/>
-        <w:numPr>
-          <w:ilvl w:val="0"/>
-          <w:numId w:val="23"/>
-        </w:numPr>
-        <w:rPr>
-          <w:b/>
-          <w:bCs/>
-        </w:rPr>
-      </w:pPr>
-      <w:r>
-        <w:rPr>
-          <w:b/>
-          <w:bCs/>
-        </w:rPr>
-        <w:t>Geschäftslogik</w:t>
-      </w:r>
-    </w:p>
-    <w:p>
-      <w:pPr>
-        <w:pStyle w:val="Listenabsatz"/>
-        <w:numPr>
-          <w:ilvl w:val="1"/>
-          <w:numId w:val="23"/>
-        </w:numPr>
-        <w:rPr>
-          <w:b/>
-          <w:bCs/>
-        </w:rPr>
-      </w:pPr>
-      <w:r>
-        <w:rPr>
-          <w:b/>
-          <w:bCs/>
-        </w:rPr>
-        <w:t>Entwicklung und Anbindung des Servers</w:t>
-      </w:r>
-    </w:p>
-    <w:p>
-      <w:pPr>
-        <w:pStyle w:val="Listenabsatz"/>
-        <w:numPr>
-          <w:ilvl w:val="1"/>
-          <w:numId w:val="23"/>
-        </w:numPr>
-        <w:rPr>
-          <w:b/>
-          <w:bCs/>
-        </w:rPr>
-      </w:pPr>
-      <w:r>
-        <w:rPr>
-          <w:b/>
-          <w:bCs/>
-        </w:rPr>
-        <w:t>Registrierung und Anmeldung</w:t>
-      </w:r>
-    </w:p>
-    <w:p>
-      <w:pPr>
-        <w:pStyle w:val="Listenabsatz"/>
-        <w:numPr>
-          <w:ilvl w:val="1"/>
-          <w:numId w:val="23"/>
-        </w:numPr>
-        <w:rPr>
-          <w:b/>
-          <w:bCs/>
-        </w:rPr>
-      </w:pPr>
-      <w:r>
-        <w:rPr>
-          <w:b/>
-          <w:bCs/>
-        </w:rPr>
-        <w:t>QR-Code-Scan</w:t>
-      </w:r>
-    </w:p>
-    <w:p>
-      <w:pPr>
-        <w:pStyle w:val="Listenabsatz"/>
-        <w:numPr>
-          <w:ilvl w:val="1"/>
-          <w:numId w:val="23"/>
-        </w:numPr>
-        <w:rPr>
-          <w:b/>
-          <w:bCs/>
-        </w:rPr>
-      </w:pPr>
-      <w:r>
-        <w:rPr>
-          <w:b/>
-          <w:bCs/>
-        </w:rPr>
-        <w:t>Hochladen von Video/Fotomaterial</w:t>
-      </w:r>
-    </w:p>
-    <w:p>
-      <w:pPr>
-        <w:pStyle w:val="Listenabsatz"/>
-        <w:numPr>
-          <w:ilvl w:val="1"/>
-          <w:numId w:val="23"/>
-        </w:numPr>
-        <w:rPr>
-          <w:b/>
-          <w:bCs/>
-        </w:rPr>
-      </w:pPr>
-      <w:r>
-        <w:rPr>
-          <w:b/>
-          <w:bCs/>
-        </w:rPr>
-        <w:t>Benutzerinteraktion mit Video/Fotomaterial</w:t>
-      </w:r>
-    </w:p>
-    <w:p>
-      <w:pPr>
-        <w:pStyle w:val="Listenabsatz"/>
-        <w:numPr>
-          <w:ilvl w:val="0"/>
-          <w:numId w:val="23"/>
-        </w:numPr>
-        <w:rPr>
-          <w:b/>
-          <w:bCs/>
-        </w:rPr>
-      </w:pPr>
-      <w:r>
-        <w:rPr>
-          <w:b/>
-          <w:bCs/>
-        </w:rPr>
-        <w:t>Feinschliff mit Agilen Methoden, kontinuierliche Verbesserungen in mehreren Phasen</w:t>
-      </w:r>
-    </w:p>
-    <w:p>
-      <w:pPr>
-        <w:pStyle w:val="Untertitel"/>
-      </w:pPr>
-      <w:r>
-        <w:t>Arbeitspakete</w:t>
-      </w:r>
-      <w:r>
-        <w:t xml:space="preserve"> und Aufteilung</w:t>
-      </w:r>
-    </w:p>
-    <w:p>
-      <w:pPr>
-        <w:pStyle w:val="Listenabsatz"/>
-        <w:numPr>
-          <w:ilvl w:val="0"/>
-          <w:numId w:val="2"/>
-        </w:numPr>
-      </w:pPr>
-      <w:r>
-        <w:t>Server (Backend)</w:t>
-      </w:r>
-    </w:p>
-    <w:p>
-      <w:pPr>
-        <w:pStyle w:val="Listenabsatz"/>
-        <w:numPr>
-          <w:ilvl w:val="0"/>
-          <w:numId w:val="2"/>
-        </w:numPr>
-      </w:pPr>
-      <w:r>
-        <w:t>Datenbank (Backend)</w:t>
-      </w:r>
-    </w:p>
-    <w:p>
-      <w:pPr>
-        <w:pStyle w:val="Listenabsatz"/>
-        <w:numPr>
-          <w:ilvl w:val="0"/>
-          <w:numId w:val="2"/>
-        </w:numPr>
-      </w:pPr>
-      <w:r>
-        <w:t>UI (Frontend)</w:t>
-      </w:r>
-    </w:p>
-    <w:p>
-      <w:pPr>
-        <w:pStyle w:val="Listenabsatz"/>
-        <w:numPr>
-          <w:ilvl w:val="0"/>
-          <w:numId w:val="2"/>
-        </w:numPr>
-      </w:pPr>
-      <w:r>
-        <w:t>QR-Code-Scan (Frontend)</w:t>
-      </w:r>
-    </w:p>
-    <w:p>
-      <w:pPr>
-        <w:pStyle w:val="Listenabsatz"/>
-        <w:numPr>
-          <w:ilvl w:val="0"/>
-          <w:numId w:val="2"/>
-        </w:numPr>
-      </w:pPr>
-      <w:r>
-        <w:t>Geschäftslogik (Backend)</w:t>
-      </w:r>
-    </w:p>
-    <w:p>
-      <w:r>
-        <w:t>Pierre wird sich auf das Frontend konzentrieren währen Martin eher auf das Backend fokussiert ist. Natürlich wird sich untereinander ausgeholfen, sodass wir hier keine strikte Trennung vornehmen.</w:t>
-      </w:r>
-    </w:p>
-    <w:p>
-      <w:pPr>
-        <w:pStyle w:val="Untertitel"/>
-      </w:pPr>
-      <w:r>
-        <w:t>Milestones</w:t>
-      </w:r>
-    </w:p>
-    <w:p>
-      <w:pPr>
-        <w:pStyle w:val="Listenabsatz"/>
-        <w:numPr>
-          <w:ilvl w:val="0"/>
-          <w:numId w:val="2"/>
-        </w:numPr>
-        <w:rPr>
-          <w:b/>
-          <w:bCs/>
-        </w:rPr>
-      </w:pPr>
-      <w:r>
-        <w:t xml:space="preserve">Bis KW 24: </w:t>
-      </w:r>
-    </w:p>
-    <w:p>
-      <w:pPr>
-        <w:pStyle w:val="Listenabsatz"/>
-        <w:numPr>
-          <w:ilvl w:val="1"/>
-          <w:numId w:val="26"/>
-        </w:numPr>
-        <w:rPr>
-          <w:b/>
-          <w:bCs/>
-        </w:rPr>
-      </w:pPr>
-      <w:r>
-        <w:t xml:space="preserve">Datenbank entworfen, implementiert und mit </w:t>
-      </w:r>
-      <w:r>
-        <w:t>Mock Daten</w:t>
-      </w:r>
-      <w:r>
-        <w:t xml:space="preserve"> befüllt</w:t>
-      </w:r>
-      <w:r>
-        <w:t xml:space="preserve"> </w:t>
-      </w:r>
-    </w:p>
-    <w:p>
-      <w:pPr>
-        <w:pStyle w:val="Listenabsatz"/>
-        <w:numPr>
-          <w:ilvl w:val="1"/>
-          <w:numId w:val="26"/>
-        </w:numPr>
-        <w:rPr>
-          <w:b/>
-          <w:bCs/>
-        </w:rPr>
-      </w:pPr>
-      <w:r>
-        <w:t>Registrierung</w:t>
-      </w:r>
-      <w:r>
-        <w:t xml:space="preserve"> und Anmeldung möglich</w:t>
-      </w:r>
-    </w:p>
-    <w:p>
-      <w:pPr>
-        <w:pStyle w:val="Listenabsatz"/>
-        <w:numPr>
-          <w:ilvl w:val="0"/>
-          <w:numId w:val="2"/>
-        </w:numPr>
-        <w:rPr>
-          <w:b/>
-          <w:bCs/>
-        </w:rPr>
-      </w:pPr>
-      <w:r>
-        <w:t xml:space="preserve">Bis KW 25: </w:t>
-      </w:r>
-      <w:proofErr w:type="gramStart"/>
-      <w:r>
-        <w:t>UI Ansichten</w:t>
-      </w:r>
-      <w:proofErr w:type="gramEnd"/>
-      <w:r>
-        <w:t xml:space="preserve"> entworfen und implementiert</w:t>
-      </w:r>
-    </w:p>
-    <w:p>
-      <w:pPr>
-        <w:pStyle w:val="Listenabsatz"/>
-        <w:numPr>
-          <w:ilvl w:val="0"/>
-          <w:numId w:val="2"/>
-        </w:numPr>
-        <w:rPr>
-          <w:b/>
-          <w:bCs/>
-        </w:rPr>
-      </w:pPr>
-      <w:r>
-        <w:t xml:space="preserve">Bis KW 26: </w:t>
-      </w:r>
-      <w:r>
-        <w:t>Server entwickelt</w:t>
-      </w:r>
-    </w:p>
-    <w:p>
-      <w:pPr>
-        <w:pStyle w:val="Listenabsatz"/>
-        <w:numPr>
-          <w:ilvl w:val="0"/>
-          <w:numId w:val="2"/>
-        </w:numPr>
-        <w:rPr>
-          <w:b/>
-          <w:bCs/>
-        </w:rPr>
-      </w:pPr>
-      <w:r>
-        <w:t xml:space="preserve">Bis KW 27: </w:t>
-      </w:r>
-    </w:p>
-    <w:p>
-      <w:pPr>
-        <w:pStyle w:val="Listenabsatz"/>
-        <w:numPr>
-          <w:ilvl w:val="1"/>
-          <w:numId w:val="27"/>
-        </w:numPr>
-        <w:rPr>
-          <w:b/>
-          <w:bCs/>
-        </w:rPr>
-      </w:pPr>
-      <w:r>
-        <w:t>Anbindung von Server und Datenbank an UI</w:t>
-      </w:r>
-    </w:p>
-    <w:p>
-      <w:pPr>
-        <w:pStyle w:val="Listenabsatz"/>
-        <w:numPr>
-          <w:ilvl w:val="1"/>
-          <w:numId w:val="27"/>
-        </w:numPr>
-        <w:rPr>
-          <w:b/>
-          <w:bCs/>
-        </w:rPr>
-      </w:pPr>
-      <w:r>
-        <w:t xml:space="preserve"> </w:t>
-      </w:r>
-      <w:r>
-        <w:t>QR-Code-Scan funktioniert und ordnet Spiele in der Datenbank richtig zu</w:t>
-      </w:r>
-    </w:p>
-    <w:p>
-      <w:pPr>
-        <w:pStyle w:val="Untertitel"/>
-      </w:pPr>
-      <w:r>
-        <w:t>Ausblick</w:t>
-      </w:r>
-    </w:p>
-    <w:p>
-      <w:r>
         <w:rPr>
           <w:noProof/>
         </w:rPr>
         <w:drawing>
-          <wp:anchor distT="0" distB="0" distL="114300" distR="114300" simplePos="0" relativeHeight="251659264" behindDoc="0" locked="0" layoutInCell="1" allowOverlap="1" wp14:anchorId="005FE1B6" wp14:editId="4F32EE5B">
+          <wp:anchor distT="0" distB="0" distL="114300" distR="114300" simplePos="0" relativeHeight="251660288" behindDoc="0" locked="0" layoutInCell="1" allowOverlap="1" wp14:anchorId="49018639" wp14:editId="093A3513">
             <wp:simplePos x="0" y="0"/>
-            <wp:positionH relativeFrom="column">
-              <wp:posOffset>3415302</wp:posOffset>
+            <wp:positionH relativeFrom="margin">
+              <wp:align>right</wp:align>
             </wp:positionH>
             <wp:positionV relativeFrom="paragraph">
-              <wp:posOffset>582386</wp:posOffset>
+              <wp:posOffset>640592</wp:posOffset>
             </wp:positionV>
-            <wp:extent cx="408214" cy="484322"/>
+            <wp:extent cx="8864221" cy="3813490"/>
             <wp:effectExtent l="0" t="0" r="0" b="0"/>
             <wp:wrapSquare wrapText="bothSides"/>
-            <wp:docPr id="1732746964" name="Grafik 4" descr="Ein Bild, das Text, Logo, Symbol, Schrift enthält.&#10;&#10;KI-generierte Inhalte können fehlerhaft sein."/>
+            <wp:docPr id="1735751820" name="Grafik 1"/>
             <wp:cNvGraphicFramePr>
               <a:graphicFrameLocks xmlns:a="http://schemas.openxmlformats.org/drawingml/2006/main" noChangeAspect="1"/>
             </wp:cNvGraphicFramePr>
@@ -1273,7 +651,7 @@
               <a:graphicData uri="http://schemas.openxmlformats.org/drawingml/2006/picture">
                 <pic:pic xmlns:pic="http://schemas.openxmlformats.org/drawingml/2006/picture">
                   <pic:nvPicPr>
-                    <pic:cNvPr id="1732746964" name="Grafik 4" descr="Ein Bild, das Text, Logo, Symbol, Schrift enthält.&#10;&#10;KI-generierte Inhalte können fehlerhaft sein."/>
+                    <pic:cNvPr id="0" name="Picture 1"/>
                     <pic:cNvPicPr>
                       <a:picLocks noChangeAspect="1" noChangeArrowheads="1"/>
                     </pic:cNvPicPr>
@@ -1294,7 +672,7 @@
                   <pic:spPr bwMode="auto">
                     <a:xfrm>
                       <a:off x="0" y="0"/>
-                      <a:ext cx="408759" cy="484968"/>
+                      <a:ext cx="8864221" cy="3813490"/>
                     </a:xfrm>
                     <a:prstGeom prst="rect">
                       <a:avLst/>
@@ -1317,6 +695,808 @@
         </w:drawing>
       </w:r>
       <w:r>
+        <w:t xml:space="preserve">- </w:t>
+      </w:r>
+      <w:proofErr w:type="spellStart"/>
+      <w:r>
+        <w:rPr>
+          <w:b/>
+          <w:bCs/>
+        </w:rPr>
+        <w:t>SwiftUI</w:t>
+      </w:r>
+      <w:proofErr w:type="spellEnd"/>
+      <w:r>
+        <w:t xml:space="preserve">: </w:t>
+      </w:r>
+      <w:proofErr w:type="spellStart"/>
+      <w:r>
+        <w:t>SwiftUI</w:t>
+      </w:r>
+      <w:proofErr w:type="spellEnd"/>
+      <w:r>
+        <w:t xml:space="preserve"> basiert auf dem MVVM-Prinzip und enthält alle von uns benötigten Komponenten aus einer Hand.</w:t>
+      </w:r>
+    </w:p>
+    <w:p>
+      <w:r>
+        <w:t xml:space="preserve">-  </w:t>
+      </w:r>
+      <w:r>
+        <w:rPr>
+          <w:b/>
+          <w:bCs/>
+        </w:rPr>
+        <w:t>Client-Server-Modell</w:t>
+      </w:r>
+      <w:r>
+        <w:t>: Durch das Nutzen des Client-Server-Modells können wir die generierten Faninhalte an alle interessierten Personen über das Internet ausspielen.</w:t>
+      </w:r>
+    </w:p>
+    <w:p>
+      <w:r>
+        <w:t xml:space="preserve">Um unsere Modellierung besser greifbar zu machen, folgt ein (noch nicht finales) ERD unserer Datenbank. </w:t>
+      </w:r>
+      <w:r>
+        <w:t>Durch dieses in der dritten Normalform vorliegende Konzept ist es später leicht möglich die Datenbank zu erweitern.</w:t>
+      </w:r>
+      <w:r>
+        <w:t xml:space="preserve"> Es wird das Datensparsamkeitsprinzip der DSGVO gewahrt damit das Projekt rechtlich auf solidem Fundament aufbau</w:t>
+      </w:r>
+      <w:r>
+        <w:t>t.</w:t>
+      </w:r>
+    </w:p>
+    <w:p>
+      <w:pPr>
+        <w:pStyle w:val="Untertitel"/>
+      </w:pPr>
+      <w:r>
+        <w:rPr>
+          <w:noProof/>
+        </w:rPr>
+        <w:lastRenderedPageBreak/>
+        <w:drawing>
+          <wp:anchor distT="0" distB="0" distL="114300" distR="114300" simplePos="0" relativeHeight="251661312" behindDoc="0" locked="0" layoutInCell="1" allowOverlap="1" wp14:anchorId="2B2E8B3A" wp14:editId="6A8B7989">
+            <wp:simplePos x="0" y="0"/>
+            <wp:positionH relativeFrom="margin">
+              <wp:posOffset>102966</wp:posOffset>
+            </wp:positionH>
+            <wp:positionV relativeFrom="paragraph">
+              <wp:posOffset>343463</wp:posOffset>
+            </wp:positionV>
+            <wp:extent cx="8927465" cy="5022215"/>
+            <wp:effectExtent l="0" t="0" r="6985" b="6985"/>
+            <wp:wrapSquare wrapText="bothSides"/>
+            <wp:docPr id="987978094" name="Grafik 2"/>
+            <wp:cNvGraphicFramePr>
+              <a:graphicFrameLocks xmlns:a="http://schemas.openxmlformats.org/drawingml/2006/main" noChangeAspect="1"/>
+            </wp:cNvGraphicFramePr>
+            <a:graphic xmlns:a="http://schemas.openxmlformats.org/drawingml/2006/main">
+              <a:graphicData uri="http://schemas.openxmlformats.org/drawingml/2006/picture">
+                <pic:pic xmlns:pic="http://schemas.openxmlformats.org/drawingml/2006/picture">
+                  <pic:nvPicPr>
+                    <pic:cNvPr id="0" name="Picture 2"/>
+                    <pic:cNvPicPr>
+                      <a:picLocks noChangeAspect="1" noChangeArrowheads="1"/>
+                    </pic:cNvPicPr>
+                  </pic:nvPicPr>
+                  <pic:blipFill>
+                    <a:blip r:embed="rId9">
+                      <a:extLst>
+                        <a:ext uri="{28A0092B-C50C-407E-A947-70E740481C1C}">
+                          <a14:useLocalDpi xmlns:a14="http://schemas.microsoft.com/office/drawing/2010/main" val="0"/>
+                        </a:ext>
+                      </a:extLst>
+                    </a:blip>
+                    <a:srcRect/>
+                    <a:stretch>
+                      <a:fillRect/>
+                    </a:stretch>
+                  </pic:blipFill>
+                  <pic:spPr bwMode="auto">
+                    <a:xfrm>
+                      <a:off x="0" y="0"/>
+                      <a:ext cx="8927465" cy="5022215"/>
+                    </a:xfrm>
+                    <a:prstGeom prst="rect">
+                      <a:avLst/>
+                    </a:prstGeom>
+                    <a:noFill/>
+                    <a:ln>
+                      <a:noFill/>
+                    </a:ln>
+                  </pic:spPr>
+                </pic:pic>
+              </a:graphicData>
+            </a:graphic>
+            <wp14:sizeRelH relativeFrom="page">
+              <wp14:pctWidth>0</wp14:pctWidth>
+            </wp14:sizeRelH>
+            <wp14:sizeRelV relativeFrom="page">
+              <wp14:pctHeight>0</wp14:pctHeight>
+            </wp14:sizeRelV>
+          </wp:anchor>
+        </w:drawing>
+      </w:r>
+      <w:r>
+        <w:t xml:space="preserve"> </w:t>
+      </w:r>
+      <w:r>
+        <w:t>Designideen</w:t>
+      </w:r>
+    </w:p>
+    <w:p>
+      <w:pPr>
+        <w:rPr>
+          <w:b/>
+          <w:bCs/>
+        </w:rPr>
+      </w:pPr>
+    </w:p>
+    <w:p>
+      <w:pPr>
+        <w:rPr>
+          <w:b/>
+          <w:bCs/>
+        </w:rPr>
+      </w:pPr>
+    </w:p>
+    <w:p>
+      <w:pPr>
+        <w:rPr>
+          <w:b/>
+          <w:bCs/>
+        </w:rPr>
+      </w:pPr>
+    </w:p>
+    <w:p>
+      <w:pPr>
+        <w:pStyle w:val="Untertitel"/>
+      </w:pPr>
+      <w:r>
+        <w:lastRenderedPageBreak/>
+        <w:t>Vorgehensweise</w:t>
+      </w:r>
+    </w:p>
+    <w:p>
+      <w:pPr>
+        <w:pStyle w:val="Listenabsatz"/>
+        <w:numPr>
+          <w:ilvl w:val="0"/>
+          <w:numId w:val="23"/>
+        </w:numPr>
+        <w:rPr>
+          <w:b/>
+          <w:bCs/>
+        </w:rPr>
+      </w:pPr>
+      <w:r>
+        <w:rPr>
+          <w:b/>
+          <w:bCs/>
+        </w:rPr>
+        <w:t>Entwurf einer Datenbankstruktur</w:t>
+      </w:r>
+    </w:p>
+    <w:p>
+      <w:pPr>
+        <w:pStyle w:val="Listenabsatz"/>
+        <w:numPr>
+          <w:ilvl w:val="0"/>
+          <w:numId w:val="23"/>
+        </w:numPr>
+        <w:rPr>
+          <w:b/>
+          <w:bCs/>
+        </w:rPr>
+      </w:pPr>
+      <w:r>
+        <w:rPr>
+          <w:b/>
+          <w:bCs/>
+        </w:rPr>
+        <w:t xml:space="preserve">Erstellen und Einpflegen von </w:t>
+      </w:r>
+      <w:proofErr w:type="spellStart"/>
+      <w:r>
+        <w:rPr>
+          <w:b/>
+          <w:bCs/>
+        </w:rPr>
+        <w:t>Mockdaten</w:t>
+      </w:r>
+      <w:proofErr w:type="spellEnd"/>
+      <w:r>
+        <w:rPr>
+          <w:b/>
+          <w:bCs/>
+        </w:rPr>
+        <w:t xml:space="preserve"> </w:t>
+      </w:r>
+    </w:p>
+    <w:p>
+      <w:pPr>
+        <w:pStyle w:val="Listenabsatz"/>
+        <w:numPr>
+          <w:ilvl w:val="0"/>
+          <w:numId w:val="23"/>
+        </w:numPr>
+        <w:rPr>
+          <w:b/>
+          <w:bCs/>
+        </w:rPr>
+      </w:pPr>
+      <w:r>
+        <w:rPr>
+          <w:b/>
+          <w:bCs/>
+        </w:rPr>
+        <w:t>Erstellung der Benutzeroberfläche</w:t>
+      </w:r>
+    </w:p>
+    <w:p>
+      <w:pPr>
+        <w:pStyle w:val="Listenabsatz"/>
+        <w:numPr>
+          <w:ilvl w:val="1"/>
+          <w:numId w:val="23"/>
+        </w:numPr>
+        <w:rPr>
+          <w:b/>
+          <w:bCs/>
+        </w:rPr>
+      </w:pPr>
+      <w:r>
+        <w:rPr>
+          <w:b/>
+          <w:bCs/>
+        </w:rPr>
+        <w:t>Anmeldesicht</w:t>
+      </w:r>
+    </w:p>
+    <w:p>
+      <w:pPr>
+        <w:pStyle w:val="Listenabsatz"/>
+        <w:numPr>
+          <w:ilvl w:val="1"/>
+          <w:numId w:val="23"/>
+        </w:numPr>
+        <w:rPr>
+          <w:b/>
+          <w:bCs/>
+        </w:rPr>
+      </w:pPr>
+      <w:proofErr w:type="spellStart"/>
+      <w:r>
+        <w:rPr>
+          <w:b/>
+          <w:bCs/>
+        </w:rPr>
+        <w:t>Uploadansicht</w:t>
+      </w:r>
+      <w:proofErr w:type="spellEnd"/>
+    </w:p>
+    <w:p>
+      <w:pPr>
+        <w:pStyle w:val="Listenabsatz"/>
+        <w:numPr>
+          <w:ilvl w:val="1"/>
+          <w:numId w:val="23"/>
+        </w:numPr>
+        <w:rPr>
+          <w:b/>
+          <w:bCs/>
+        </w:rPr>
+      </w:pPr>
+      <w:r>
+        <w:rPr>
+          <w:b/>
+          <w:bCs/>
+        </w:rPr>
+        <w:t>Spielansicht</w:t>
+      </w:r>
+    </w:p>
+    <w:p>
+      <w:pPr>
+        <w:pStyle w:val="Listenabsatz"/>
+        <w:numPr>
+          <w:ilvl w:val="1"/>
+          <w:numId w:val="23"/>
+        </w:numPr>
+        <w:rPr>
+          <w:b/>
+          <w:bCs/>
+        </w:rPr>
+      </w:pPr>
+      <w:r>
+        <w:rPr>
+          <w:b/>
+          <w:bCs/>
+        </w:rPr>
+        <w:t>Zeitleiste</w:t>
+      </w:r>
+    </w:p>
+    <w:p>
+      <w:pPr>
+        <w:pStyle w:val="Listenabsatz"/>
+        <w:numPr>
+          <w:ilvl w:val="1"/>
+          <w:numId w:val="23"/>
+        </w:numPr>
+        <w:rPr>
+          <w:b/>
+          <w:bCs/>
+        </w:rPr>
+      </w:pPr>
+      <w:r>
+        <w:rPr>
+          <w:b/>
+          <w:bCs/>
+        </w:rPr>
+        <w:t>(Optional) Spielhistorie</w:t>
+      </w:r>
+    </w:p>
+    <w:p>
+      <w:pPr>
+        <w:pStyle w:val="Listenabsatz"/>
+        <w:numPr>
+          <w:ilvl w:val="0"/>
+          <w:numId w:val="23"/>
+        </w:numPr>
+        <w:rPr>
+          <w:b/>
+          <w:bCs/>
+        </w:rPr>
+      </w:pPr>
+      <w:r>
+        <w:rPr>
+          <w:b/>
+          <w:bCs/>
+        </w:rPr>
+        <w:t>Geschäftslogik</w:t>
+      </w:r>
+    </w:p>
+    <w:p>
+      <w:pPr>
+        <w:pStyle w:val="Listenabsatz"/>
+        <w:numPr>
+          <w:ilvl w:val="1"/>
+          <w:numId w:val="23"/>
+        </w:numPr>
+        <w:rPr>
+          <w:b/>
+          <w:bCs/>
+        </w:rPr>
+      </w:pPr>
+      <w:r>
+        <w:rPr>
+          <w:b/>
+          <w:bCs/>
+        </w:rPr>
+        <w:t>Entwicklung und Anbindung des Servers</w:t>
+      </w:r>
+    </w:p>
+    <w:p>
+      <w:pPr>
+        <w:pStyle w:val="Listenabsatz"/>
+        <w:numPr>
+          <w:ilvl w:val="1"/>
+          <w:numId w:val="23"/>
+        </w:numPr>
+        <w:rPr>
+          <w:b/>
+          <w:bCs/>
+        </w:rPr>
+      </w:pPr>
+      <w:r>
+        <w:rPr>
+          <w:b/>
+          <w:bCs/>
+        </w:rPr>
+        <w:t>Registrierung und Anmeldung</w:t>
+      </w:r>
+    </w:p>
+    <w:p>
+      <w:pPr>
+        <w:pStyle w:val="Listenabsatz"/>
+        <w:numPr>
+          <w:ilvl w:val="1"/>
+          <w:numId w:val="23"/>
+        </w:numPr>
+        <w:rPr>
+          <w:b/>
+          <w:bCs/>
+        </w:rPr>
+      </w:pPr>
+      <w:r>
+        <w:rPr>
+          <w:b/>
+          <w:bCs/>
+        </w:rPr>
+        <w:t>QR-Code-Scan</w:t>
+      </w:r>
+    </w:p>
+    <w:p>
+      <w:pPr>
+        <w:pStyle w:val="Listenabsatz"/>
+        <w:numPr>
+          <w:ilvl w:val="1"/>
+          <w:numId w:val="23"/>
+        </w:numPr>
+        <w:rPr>
+          <w:b/>
+          <w:bCs/>
+        </w:rPr>
+      </w:pPr>
+      <w:r>
+        <w:rPr>
+          <w:b/>
+          <w:bCs/>
+        </w:rPr>
+        <w:t>Hochladen von Video/Fotomaterial</w:t>
+      </w:r>
+    </w:p>
+    <w:p>
+      <w:pPr>
+        <w:pStyle w:val="Listenabsatz"/>
+        <w:numPr>
+          <w:ilvl w:val="1"/>
+          <w:numId w:val="23"/>
+        </w:numPr>
+        <w:rPr>
+          <w:b/>
+          <w:bCs/>
+        </w:rPr>
+      </w:pPr>
+      <w:r>
+        <w:rPr>
+          <w:b/>
+          <w:bCs/>
+        </w:rPr>
+        <w:t>Benutzerinteraktion mit Video/Fotomaterial</w:t>
+      </w:r>
+    </w:p>
+    <w:p>
+      <w:pPr>
+        <w:pStyle w:val="Listenabsatz"/>
+        <w:numPr>
+          <w:ilvl w:val="0"/>
+          <w:numId w:val="23"/>
+        </w:numPr>
+        <w:rPr>
+          <w:b/>
+          <w:bCs/>
+        </w:rPr>
+      </w:pPr>
+      <w:r>
+        <w:rPr>
+          <w:b/>
+          <w:bCs/>
+        </w:rPr>
+        <w:t>Feinschliff mit Agilen Methoden, kontinuierliche Verbesserungen in mehreren Phasen</w:t>
+      </w:r>
+    </w:p>
+    <w:p>
+      <w:pPr>
+        <w:pStyle w:val="Untertitel"/>
+      </w:pPr>
+      <w:r>
+        <w:t>Arbeitspakete</w:t>
+      </w:r>
+      <w:r>
+        <w:t xml:space="preserve"> und Aufteilung</w:t>
+      </w:r>
+    </w:p>
+    <w:p>
+      <w:pPr>
+        <w:pStyle w:val="Listenabsatz"/>
+        <w:numPr>
+          <w:ilvl w:val="0"/>
+          <w:numId w:val="2"/>
+        </w:numPr>
+      </w:pPr>
+      <w:r>
+        <w:t>Server (Backend)</w:t>
+      </w:r>
+    </w:p>
+    <w:p>
+      <w:pPr>
+        <w:pStyle w:val="Listenabsatz"/>
+        <w:numPr>
+          <w:ilvl w:val="0"/>
+          <w:numId w:val="2"/>
+        </w:numPr>
+      </w:pPr>
+      <w:r>
+        <w:t>Datenbank (Backend)</w:t>
+      </w:r>
+    </w:p>
+    <w:p>
+      <w:pPr>
+        <w:pStyle w:val="Listenabsatz"/>
+        <w:numPr>
+          <w:ilvl w:val="0"/>
+          <w:numId w:val="2"/>
+        </w:numPr>
+      </w:pPr>
+      <w:r>
+        <w:t>UI (Frontend)</w:t>
+      </w:r>
+    </w:p>
+    <w:p>
+      <w:pPr>
+        <w:pStyle w:val="Listenabsatz"/>
+        <w:numPr>
+          <w:ilvl w:val="0"/>
+          <w:numId w:val="2"/>
+        </w:numPr>
+      </w:pPr>
+      <w:r>
+        <w:t>QR-Code-Scan (Frontend)</w:t>
+      </w:r>
+    </w:p>
+    <w:p>
+      <w:pPr>
+        <w:pStyle w:val="Listenabsatz"/>
+        <w:numPr>
+          <w:ilvl w:val="0"/>
+          <w:numId w:val="2"/>
+        </w:numPr>
+      </w:pPr>
+      <w:r>
+        <w:t>Geschäftslogik (Backend)</w:t>
+      </w:r>
+    </w:p>
+    <w:p>
+      <w:r>
+        <w:t>Pierre wird sich auf das Frontend konzentrieren währen Martin eher auf das Backend fokussiert ist. Natürlich wird sich untereinander ausgeholfen, sodass wir hier keine strikte Trennung vornehmen.</w:t>
+      </w:r>
+    </w:p>
+    <w:p>
+      <w:pPr>
+        <w:pStyle w:val="Untertitel"/>
+      </w:pPr>
+    </w:p>
+    <w:p>
+      <w:pPr>
+        <w:pStyle w:val="Untertitel"/>
+      </w:pPr>
+      <w:r>
+        <w:t>Milestones</w:t>
+      </w:r>
+    </w:p>
+    <w:p>
+      <w:pPr>
+        <w:pStyle w:val="Listenabsatz"/>
+        <w:numPr>
+          <w:ilvl w:val="0"/>
+          <w:numId w:val="2"/>
+        </w:numPr>
+        <w:rPr>
+          <w:b/>
+          <w:bCs/>
+        </w:rPr>
+      </w:pPr>
+      <w:r>
+        <w:t xml:space="preserve">Bis KW 24: </w:t>
+      </w:r>
+    </w:p>
+    <w:p>
+      <w:pPr>
+        <w:pStyle w:val="Listenabsatz"/>
+        <w:numPr>
+          <w:ilvl w:val="1"/>
+          <w:numId w:val="26"/>
+        </w:numPr>
+        <w:rPr>
+          <w:b/>
+          <w:bCs/>
+        </w:rPr>
+      </w:pPr>
+      <w:r>
+        <w:t xml:space="preserve">Datenbank entworfen, implementiert und mit </w:t>
+      </w:r>
+      <w:r>
+        <w:t>Mock Daten</w:t>
+      </w:r>
+      <w:r>
+        <w:t xml:space="preserve"> befüllt</w:t>
+      </w:r>
+      <w:r>
+        <w:t xml:space="preserve"> </w:t>
+      </w:r>
+    </w:p>
+    <w:p>
+      <w:pPr>
+        <w:pStyle w:val="Listenabsatz"/>
+        <w:numPr>
+          <w:ilvl w:val="1"/>
+          <w:numId w:val="26"/>
+        </w:numPr>
+        <w:rPr>
+          <w:b/>
+          <w:bCs/>
+        </w:rPr>
+      </w:pPr>
+      <w:r>
+        <w:t>Registrierung</w:t>
+      </w:r>
+      <w:r>
+        <w:t xml:space="preserve"> und Anmeldung möglich</w:t>
+      </w:r>
+    </w:p>
+    <w:p>
+      <w:pPr>
+        <w:pStyle w:val="Listenabsatz"/>
+        <w:numPr>
+          <w:ilvl w:val="0"/>
+          <w:numId w:val="2"/>
+        </w:numPr>
+        <w:rPr>
+          <w:b/>
+          <w:bCs/>
+        </w:rPr>
+      </w:pPr>
+      <w:r>
+        <w:t xml:space="preserve">Bis KW 25: </w:t>
+      </w:r>
+      <w:proofErr w:type="gramStart"/>
+      <w:r>
+        <w:t>UI Ansichten</w:t>
+      </w:r>
+      <w:proofErr w:type="gramEnd"/>
+      <w:r>
+        <w:t xml:space="preserve"> entworfen und implementiert</w:t>
+      </w:r>
+    </w:p>
+    <w:p>
+      <w:pPr>
+        <w:pStyle w:val="Listenabsatz"/>
+        <w:numPr>
+          <w:ilvl w:val="0"/>
+          <w:numId w:val="2"/>
+        </w:numPr>
+        <w:rPr>
+          <w:b/>
+          <w:bCs/>
+        </w:rPr>
+      </w:pPr>
+      <w:r>
+        <w:t xml:space="preserve">Bis KW 26: </w:t>
+      </w:r>
+      <w:r>
+        <w:t>Server entwickelt</w:t>
+      </w:r>
+    </w:p>
+    <w:p>
+      <w:pPr>
+        <w:pStyle w:val="Listenabsatz"/>
+        <w:numPr>
+          <w:ilvl w:val="0"/>
+          <w:numId w:val="2"/>
+        </w:numPr>
+        <w:rPr>
+          <w:b/>
+          <w:bCs/>
+        </w:rPr>
+      </w:pPr>
+      <w:r>
+        <w:t xml:space="preserve">Bis KW 27: </w:t>
+      </w:r>
+    </w:p>
+    <w:p>
+      <w:pPr>
+        <w:pStyle w:val="Listenabsatz"/>
+        <w:numPr>
+          <w:ilvl w:val="1"/>
+          <w:numId w:val="27"/>
+        </w:numPr>
+        <w:rPr>
+          <w:b/>
+          <w:bCs/>
+        </w:rPr>
+      </w:pPr>
+      <w:r>
+        <w:t>Anbindung von Server und Datenbank an UI</w:t>
+      </w:r>
+    </w:p>
+    <w:p>
+      <w:pPr>
+        <w:pStyle w:val="Listenabsatz"/>
+        <w:numPr>
+          <w:ilvl w:val="1"/>
+          <w:numId w:val="27"/>
+        </w:numPr>
+        <w:rPr>
+          <w:b/>
+          <w:bCs/>
+        </w:rPr>
+      </w:pPr>
+      <w:r>
+        <w:t xml:space="preserve"> </w:t>
+      </w:r>
+      <w:r>
+        <w:t>QR-Code-Scan funktioniert und ordnet Spiele in der Datenbank richtig zu</w:t>
+      </w:r>
+    </w:p>
+    <w:p>
+      <w:pPr>
+        <w:pStyle w:val="Untertitel"/>
+      </w:pPr>
+      <w:r>
+        <w:t>Ausblick</w:t>
+      </w:r>
+    </w:p>
+    <w:p>
+      <w:r>
+        <w:rPr>
+          <w:noProof/>
+        </w:rPr>
+        <w:drawing>
+          <wp:anchor distT="0" distB="0" distL="114300" distR="114300" simplePos="0" relativeHeight="251659264" behindDoc="0" locked="0" layoutInCell="1" allowOverlap="1" wp14:anchorId="005FE1B6" wp14:editId="0A668CD1">
+            <wp:simplePos x="0" y="0"/>
+            <wp:positionH relativeFrom="column">
+              <wp:posOffset>3432283</wp:posOffset>
+            </wp:positionH>
+            <wp:positionV relativeFrom="paragraph">
+              <wp:posOffset>616801</wp:posOffset>
+            </wp:positionV>
+            <wp:extent cx="408214" cy="484322"/>
+            <wp:effectExtent l="0" t="0" r="0" b="0"/>
+            <wp:wrapSquare wrapText="bothSides"/>
+            <wp:docPr id="1732746964" name="Grafik 4" descr="Ein Bild, das Text, Logo, Symbol, Schrift enthält.&#10;&#10;KI-generierte Inhalte können fehlerhaft sein."/>
+            <wp:cNvGraphicFramePr>
+              <a:graphicFrameLocks xmlns:a="http://schemas.openxmlformats.org/drawingml/2006/main" noChangeAspect="1"/>
+            </wp:cNvGraphicFramePr>
+            <a:graphic xmlns:a="http://schemas.openxmlformats.org/drawingml/2006/main">
+              <a:graphicData uri="http://schemas.openxmlformats.org/drawingml/2006/picture">
+                <pic:pic xmlns:pic="http://schemas.openxmlformats.org/drawingml/2006/picture">
+                  <pic:nvPicPr>
+                    <pic:cNvPr id="1732746964" name="Grafik 4" descr="Ein Bild, das Text, Logo, Symbol, Schrift enthält.&#10;&#10;KI-generierte Inhalte können fehlerhaft sein."/>
+                    <pic:cNvPicPr>
+                      <a:picLocks noChangeAspect="1" noChangeArrowheads="1"/>
+                    </pic:cNvPicPr>
+                  </pic:nvPicPr>
+                  <pic:blipFill>
+                    <a:blip r:embed="rId10" cstate="print">
+                      <a:extLst>
+                        <a:ext uri="{28A0092B-C50C-407E-A947-70E740481C1C}">
+                          <a14:useLocalDpi xmlns:a14="http://schemas.microsoft.com/office/drawing/2010/main" val="0"/>
+                        </a:ext>
+                      </a:extLst>
+                    </a:blip>
+                    <a:srcRect/>
+                    <a:stretch>
+                      <a:fillRect/>
+                    </a:stretch>
+                  </pic:blipFill>
+                  <pic:spPr bwMode="auto">
+                    <a:xfrm>
+                      <a:off x="0" y="0"/>
+                      <a:ext cx="408214" cy="484322"/>
+                    </a:xfrm>
+                    <a:prstGeom prst="rect">
+                      <a:avLst/>
+                    </a:prstGeom>
+                    <a:noFill/>
+                    <a:ln>
+                      <a:noFill/>
+                    </a:ln>
+                  </pic:spPr>
+                </pic:pic>
+              </a:graphicData>
+            </a:graphic>
+            <wp14:sizeRelH relativeFrom="page">
+              <wp14:pctWidth>0</wp14:pctWidth>
+            </wp14:sizeRelH>
+            <wp14:sizeRelV relativeFrom="page">
+              <wp14:pctHeight>0</wp14:pctHeight>
+            </wp14:sizeRelV>
+          </wp:anchor>
+        </w:drawing>
+      </w:r>
+      <w:r>
         <w:t xml:space="preserve">Die App könnte um eine Ansicht der Mannschaft zum jeweiligen Spiel erweitert werden um ihren Status als Companion-App </w:t>
       </w:r>
       <w:r>
@@ -1339,9 +1519,9 @@
       </w:r>
     </w:p>
     <w:sectPr>
-      <w:headerReference w:type="even" r:id="rId9"/>
-      <w:headerReference w:type="default" r:id="rId10"/>
-      <w:headerReference w:type="first" r:id="rId11"/>
+      <w:headerReference w:type="even" r:id="rId11"/>
+      <w:headerReference w:type="default" r:id="rId12"/>
+      <w:headerReference w:type="first" r:id="rId13"/>
       <w:pgSz w:w="16838" w:h="11906" w:orient="landscape"/>
       <w:pgMar w:top="1440" w:right="1440" w:bottom="1440" w:left="1440" w:header="708" w:footer="708" w:gutter="0"/>
       <w:cols w:num="2" w:space="708"/>

</xml_diff>